<commit_message>
Add selected portrait to resume
</commit_message>
<xml_diff>
--- a/export/resume.docx
+++ b/export/resume.docx
@@ -2,61 +2,144 @@
 <file path=word/document.xml><?xml version="1.0" encoding="utf-8"?>
 <w:document xmlns:wpc="http://schemas.microsoft.com/office/word/2010/wordprocessingCanvas" xmlns:mo="http://schemas.microsoft.com/office/mac/office/2008/main" xmlns:mc="http://schemas.openxmlformats.org/markup-compatibility/2006" xmlns:mv="urn:schemas-microsoft-com:mac:vml" xmlns:o="urn:schemas-microsoft-com:office:office" xmlns:r="http://schemas.openxmlformats.org/officeDocument/2006/relationships" xmlns:m="http://schemas.openxmlformats.org/officeDocument/2006/math" xmlns:v="urn:schemas-microsoft-com:vml" xmlns:wp14="http://schemas.microsoft.com/office/word/2010/wordprocessingDrawing" xmlns:wp="http://schemas.openxmlformats.org/drawingml/2006/wordprocessingDrawing" xmlns:w10="urn:schemas-microsoft-com:office:word" xmlns:w="http://schemas.openxmlformats.org/wordprocessingml/2006/main" xmlns:w14="http://schemas.microsoft.com/office/word/2010/wordml" xmlns:wpg="http://schemas.microsoft.com/office/word/2010/wordprocessingGroup" xmlns:wpi="http://schemas.microsoft.com/office/word/2010/wordprocessingInk" xmlns:wne="http://schemas.microsoft.com/office/word/2006/wordml" xmlns:wps="http://schemas.microsoft.com/office/word/2010/wordprocessingShape" mc:Ignorable="w14 wp14">
   <w:body>
-    <w:p>
-      <w:pPr>
-        <w:pStyle w:val="Title"/>
-      </w:pPr>
-      <w:r>
-        <w:t>Конорезов Владислав Сергеевич</w:t>
-      </w:r>
-    </w:p>
-    <w:p>
-      <w:pPr>
-        <w:pStyle w:val="Meta"/>
-      </w:pPr>
-      <w:r>
-        <w:rPr>
-          <w:b/>
-        </w:rPr>
-        <w:t>Телефон / WhatsApp / Telegram:</w:t>
-      </w:r>
-      <w:r>
-        <w:t xml:space="preserve"> +7 (965) 034-34-00</w:t>
-      </w:r>
-    </w:p>
-    <w:p>
-      <w:pPr>
-        <w:pStyle w:val="Meta"/>
-      </w:pPr>
-      <w:r>
-        <w:rPr>
-          <w:b/>
-        </w:rPr>
-        <w:t>E-mail:</w:t>
-      </w:r>
-      <w:r>
-        <w:t xml:space="preserve"> </w:t>
-      </w:r>
-      <w:hyperlink r:id="rId10">
-        <w:r>
-          <w:t>konorezov.v.s@yandex.ru</w:t>
-        </w:r>
-      </w:hyperlink>
-    </w:p>
-    <w:p>
-      <w:pPr>
-        <w:pStyle w:val="Meta"/>
-      </w:pPr>
-      <w:r>
-        <w:rPr>
-          <w:b/>
-        </w:rPr>
-        <w:t>Локация:</w:t>
-      </w:r>
-      <w:r>
-        <w:t xml:space="preserve"> Санкт-Петербург (готов рассмотреть переезд при должной мотивации)</w:t>
-      </w:r>
-    </w:p>
+    <w:tbl>
+      <w:tblPr>
+        <w:tblW w:type="dxa" w:w="9978"/>
+        <w:tblLayout w:type="fixed"/>
+        <w:tblLook w:firstColumn="1" w:firstRow="1" w:lastColumn="0" w:lastRow="0" w:noHBand="0" w:noVBand="1" w:val="04A0"/>
+        <w:tblBorders>
+          <w:top w:val="nil"/>
+          <w:left w:val="nil"/>
+          <w:bottom w:val="nil"/>
+          <w:right w:val="nil"/>
+          <w:insideH w:val="nil"/>
+          <w:insideV w:val="nil"/>
+        </w:tblBorders>
+        <w:tblCellMar>
+          <w:top w:w="0" w:type="dxa"/>
+          <w:left w:w="0" w:type="dxa"/>
+          <w:bottom w:w="0" w:type="dxa"/>
+          <w:right w:w="0" w:type="dxa"/>
+        </w:tblCellMar>
+      </w:tblPr>
+      <w:tblGrid>
+        <w:gridCol w:w="7994"/>
+        <w:gridCol w:w="1984"/>
+      </w:tblGrid>
+      <w:tr>
+        <w:trPr>
+          <w:cantSplit/>
+        </w:trPr>
+        <w:tc>
+          <w:tcPr>
+            <w:tcW w:type="dxa" w:w="7994"/>
+            <w:vAlign w:val="top"/>
+          </w:tcPr>
+          <w:p>
+            <w:pPr>
+              <w:pStyle w:val="Title"/>
+            </w:pPr>
+            <w:r>
+              <w:t>Конорезов Владислав Сергеевич</w:t>
+            </w:r>
+          </w:p>
+          <w:p>
+            <w:pPr>
+              <w:pStyle w:val="Meta"/>
+            </w:pPr>
+            <w:r>
+              <w:rPr>
+                <w:b/>
+              </w:rPr>
+              <w:t>Телефон / WhatsApp / Telegram:</w:t>
+            </w:r>
+            <w:r>
+              <w:t xml:space="preserve"> +7 (965) 034-34-00</w:t>
+            </w:r>
+          </w:p>
+          <w:p>
+            <w:pPr>
+              <w:pStyle w:val="Meta"/>
+            </w:pPr>
+            <w:r>
+              <w:rPr>
+                <w:b/>
+              </w:rPr>
+              <w:t>E-mail:</w:t>
+            </w:r>
+            <w:r>
+              <w:t xml:space="preserve"> </w:t>
+            </w:r>
+            <w:hyperlink r:id="rId10">
+              <w:r>
+                <w:t>konorezov.v.s@yandex.ru</w:t>
+              </w:r>
+            </w:hyperlink>
+          </w:p>
+          <w:p>
+            <w:pPr>
+              <w:pStyle w:val="Meta"/>
+            </w:pPr>
+            <w:r>
+              <w:rPr>
+                <w:b/>
+              </w:rPr>
+              <w:t>Локация:</w:t>
+            </w:r>
+            <w:r>
+              <w:t xml:space="preserve"> Санкт-Петербург (готов рассмотреть переезд при должной мотивации)</w:t>
+            </w:r>
+          </w:p>
+        </w:tc>
+        <w:tc>
+          <w:tcPr>
+            <w:tcW w:type="dxa" w:w="1984"/>
+            <w:vAlign w:val="top"/>
+          </w:tcPr>
+          <w:p>
+            <w:pPr>
+              <w:keepNext w:val="0"/>
+              <w:spacing w:before="0" w:after="0"/>
+              <w:jc w:val="right"/>
+            </w:pPr>
+            <w:r>
+              <w:drawing>
+                <wp:inline xmlns:a="http://schemas.openxmlformats.org/drawingml/2006/main" xmlns:pic="http://schemas.openxmlformats.org/drawingml/2006/picture">
+                  <wp:extent cx="1080000" cy="1260465"/>
+                  <wp:docPr id="1" name="Picture 1"/>
+                  <wp:cNvGraphicFramePr>
+                    <a:graphicFrameLocks noChangeAspect="1"/>
+                  </wp:cNvGraphicFramePr>
+                  <a:graphic>
+                    <a:graphicData uri="http://schemas.openxmlformats.org/drawingml/2006/picture">
+                      <pic:pic>
+                        <pic:nvPicPr>
+                          <pic:cNvPr id="0" name="portrait.png"/>
+                          <pic:cNvPicPr/>
+                        </pic:nvPicPr>
+                        <pic:blipFill>
+                          <a:blip r:embed="rId11"/>
+                          <a:stretch>
+                            <a:fillRect/>
+                          </a:stretch>
+                        </pic:blipFill>
+                        <pic:spPr>
+                          <a:xfrm>
+                            <a:off x="0" y="0"/>
+                            <a:ext cx="1080000" cy="1260465"/>
+                          </a:xfrm>
+                          <a:prstGeom prst="rect"/>
+                        </pic:spPr>
+                      </pic:pic>
+                    </a:graphicData>
+                  </a:graphic>
+                </wp:inline>
+              </w:drawing>
+            </w:r>
+          </w:p>
+        </w:tc>
+      </w:tr>
+    </w:tbl>
     <w:p>
       <w:pPr>
         <w:pStyle w:val="Heading1"/>

</xml_diff>